<commit_message>
Cambios Mockups y Wireframes
</commit_message>
<xml_diff>
--- a/Proyecto2ºNoelFdez.docx
+++ b/Proyecto2ºNoelFdez.docx
@@ -11648,24 +11648,14 @@
       <w:r>
         <w:t xml:space="preserve">FIGURA </w:t>
       </w:r>
-      <w:r>
-        <w:fldChar w:fldCharType="begin"/>
-      </w:r>
-      <w:r>
-        <w:instrText xml:space="preserve"> SEQ FIGURA \* ARABIC </w:instrText>
-      </w:r>
-      <w:r>
-        <w:fldChar w:fldCharType="separate"/>
-      </w:r>
-      <w:r>
-        <w:rPr>
-          <w:noProof/>
-        </w:rPr>
-        <w:t>1</w:t>
-      </w:r>
-      <w:r>
-        <w:fldChar w:fldCharType="end"/>
-      </w:r>
+      <w:fldSimple w:instr=" SEQ FIGURA \* ARABIC ">
+        <w:r>
+          <w:rPr>
+            <w:noProof/>
+          </w:rPr>
+          <w:t>1</w:t>
+        </w:r>
+      </w:fldSimple>
       <w:r>
         <w:t xml:space="preserve"> Temporalidad del proyecto. Elaboración propia.</w:t>
       </w:r>
@@ -12992,27 +12982,14 @@
       <w:r>
         <w:t xml:space="preserve">FIGURA </w:t>
       </w:r>
-      <w:r>
-        <w:fldChar w:fldCharType="begin"/>
-      </w:r>
-      <w:r>
-        <w:instrText xml:space="preserve"> SEQ FIGURA \* ARABIC </w:instrText>
-      </w:r>
-      <w:r>
-        <w:fldChar w:fldCharType="separate"/>
-      </w:r>
-      <w:r>
-        <w:rPr>
-          <w:noProof/>
-        </w:rPr>
-        <w:t>2</w:t>
-      </w:r>
-      <w:r>
-        <w:rPr>
-          <w:noProof/>
-        </w:rPr>
-        <w:fldChar w:fldCharType="end"/>
-      </w:r>
+      <w:fldSimple w:instr=" SEQ FIGURA \* ARABIC ">
+        <w:r>
+          <w:rPr>
+            <w:noProof/>
+          </w:rPr>
+          <w:t>2</w:t>
+        </w:r>
+      </w:fldSimple>
       <w:r>
         <w:t>: Logotipo FoodNow. Realización propia.</w:t>
       </w:r>
@@ -30905,10 +30882,10 @@
           <w:noProof/>
         </w:rPr>
         <w:drawing>
-          <wp:inline distT="0" distB="0" distL="0" distR="0" wp14:anchorId="03F5FBA9" wp14:editId="2B48566D">
-            <wp:extent cx="5356860" cy="3616415"/>
-            <wp:effectExtent l="0" t="0" r="0" b="3175"/>
-            <wp:docPr id="1923795273" name="Imagen 2"/>
+          <wp:inline distT="0" distB="0" distL="0" distR="0" wp14:anchorId="0B3474FC" wp14:editId="301B0763">
+            <wp:extent cx="5299054" cy="3558540"/>
+            <wp:effectExtent l="0" t="0" r="0" b="3810"/>
+            <wp:docPr id="1946438895" name="Imagen 1"/>
             <wp:cNvGraphicFramePr>
               <a:graphicFrameLocks xmlns:a="http://schemas.openxmlformats.org/drawingml/2006/main" noChangeAspect="1"/>
             </wp:cNvGraphicFramePr>
@@ -30937,7 +30914,7 @@
                   <pic:spPr bwMode="auto">
                     <a:xfrm>
                       <a:off x="0" y="0"/>
-                      <a:ext cx="5371003" cy="3625963"/>
+                      <a:ext cx="5309594" cy="3565618"/>
                     </a:xfrm>
                     <a:prstGeom prst="rect">
                       <a:avLst/>
@@ -31010,11 +30987,6 @@
     </w:p>
     <w:p>
       <w:pPr>
-        <w:spacing w:line="360" w:lineRule="auto"/>
-      </w:pPr>
-    </w:p>
-    <w:p>
-      <w:pPr>
         <w:keepNext/>
         <w:spacing w:line="360" w:lineRule="auto"/>
       </w:pPr>
@@ -31023,10 +30995,10 @@
           <w:noProof/>
         </w:rPr>
         <w:drawing>
-          <wp:inline distT="0" distB="0" distL="0" distR="0" wp14:anchorId="60E7CB53" wp14:editId="012F9487">
-            <wp:extent cx="5349240" cy="3606470"/>
-            <wp:effectExtent l="0" t="0" r="3810" b="0"/>
-            <wp:docPr id="919878215" name="Imagen 3"/>
+          <wp:inline distT="0" distB="0" distL="0" distR="0" wp14:anchorId="7D6627C3" wp14:editId="447325F4">
+            <wp:extent cx="5280660" cy="3560232"/>
+            <wp:effectExtent l="0" t="0" r="0" b="2540"/>
+            <wp:docPr id="1883045618" name="Imagen 2"/>
             <wp:cNvGraphicFramePr>
               <a:graphicFrameLocks xmlns:a="http://schemas.openxmlformats.org/drawingml/2006/main" noChangeAspect="1"/>
             </wp:cNvGraphicFramePr>
@@ -31055,7 +31027,7 @@
                   <pic:spPr bwMode="auto">
                     <a:xfrm>
                       <a:off x="0" y="0"/>
-                      <a:ext cx="5378318" cy="3626075"/>
+                      <a:ext cx="5290034" cy="3566552"/>
                     </a:xfrm>
                     <a:prstGeom prst="rect">
                       <a:avLst/>
@@ -31137,10 +31109,10 @@
         </w:rPr>
         <w:lastRenderedPageBreak/>
         <w:drawing>
-          <wp:inline distT="0" distB="0" distL="0" distR="0" wp14:anchorId="1BC514A0" wp14:editId="741C0568">
-            <wp:extent cx="5341620" cy="3615537"/>
-            <wp:effectExtent l="0" t="0" r="0" b="4445"/>
-            <wp:docPr id="39316273" name="Imagen 5"/>
+          <wp:inline distT="0" distB="0" distL="0" distR="0" wp14:anchorId="3AF3B3C7" wp14:editId="132A0F45">
+            <wp:extent cx="5379720" cy="3641326"/>
+            <wp:effectExtent l="0" t="0" r="0" b="0"/>
+            <wp:docPr id="938553941" name="Imagen 3"/>
             <wp:cNvGraphicFramePr>
               <a:graphicFrameLocks xmlns:a="http://schemas.openxmlformats.org/drawingml/2006/main" noChangeAspect="1"/>
             </wp:cNvGraphicFramePr>
@@ -31148,7 +31120,7 @@
               <a:graphicData uri="http://schemas.openxmlformats.org/drawingml/2006/picture">
                 <pic:pic xmlns:pic="http://schemas.openxmlformats.org/drawingml/2006/picture">
                   <pic:nvPicPr>
-                    <pic:cNvPr id="0" name="Picture 4"/>
+                    <pic:cNvPr id="0" name="Picture 3"/>
                     <pic:cNvPicPr>
                       <a:picLocks noChangeAspect="1" noChangeArrowheads="1"/>
                     </pic:cNvPicPr>
@@ -31169,7 +31141,7 @@
                   <pic:spPr bwMode="auto">
                     <a:xfrm>
                       <a:off x="0" y="0"/>
-                      <a:ext cx="5353286" cy="3623433"/>
+                      <a:ext cx="5385509" cy="3645244"/>
                     </a:xfrm>
                     <a:prstGeom prst="rect">
                       <a:avLst/>
@@ -31236,7 +31208,33 @@
         <w:rPr>
           <w:rFonts w:ascii="Times New Roman" w:hAnsi="Times New Roman" w:cs="Times New Roman"/>
         </w:rPr>
-        <w:t>: Wireframe ventana de notificaciones de la aplicación de escritorio. Elaboración propia.</w:t>
+        <w:t xml:space="preserve">: </w:t>
+      </w:r>
+      <w:proofErr w:type="spellStart"/>
+      <w:r>
+        <w:rPr>
+          <w:rFonts w:ascii="Times New Roman" w:hAnsi="Times New Roman" w:cs="Times New Roman"/>
+        </w:rPr>
+        <w:t>Wireframe</w:t>
+      </w:r>
+      <w:proofErr w:type="spellEnd"/>
+      <w:r>
+        <w:rPr>
+          <w:rFonts w:ascii="Times New Roman" w:hAnsi="Times New Roman" w:cs="Times New Roman"/>
+        </w:rPr>
+        <w:t xml:space="preserve"> ventana de notificaciones</w:t>
+      </w:r>
+      <w:r>
+        <w:rPr>
+          <w:rFonts w:ascii="Times New Roman" w:hAnsi="Times New Roman" w:cs="Times New Roman"/>
+        </w:rPr>
+        <w:t xml:space="preserve"> </w:t>
+      </w:r>
+      <w:r>
+        <w:rPr>
+          <w:rFonts w:ascii="Times New Roman" w:hAnsi="Times New Roman" w:cs="Times New Roman"/>
+        </w:rPr>
+        <w:t>de la aplicación de escritorio. Elaboración propia.</w:t>
       </w:r>
       <w:bookmarkEnd w:id="44"/>
     </w:p>
@@ -31289,10 +31287,10 @@
           <w:noProof/>
         </w:rPr>
         <w:drawing>
-          <wp:inline distT="0" distB="0" distL="0" distR="0" wp14:anchorId="3C1DF05B" wp14:editId="60C33554">
-            <wp:extent cx="5402580" cy="3635246"/>
-            <wp:effectExtent l="0" t="0" r="7620" b="3810"/>
-            <wp:docPr id="973815367" name="Imagen 6"/>
+          <wp:inline distT="0" distB="0" distL="0" distR="0" wp14:anchorId="4AFADDDF" wp14:editId="2E1791C8">
+            <wp:extent cx="5394960" cy="3644468"/>
+            <wp:effectExtent l="0" t="0" r="0" b="0"/>
+            <wp:docPr id="940273282" name="Imagen 4"/>
             <wp:cNvGraphicFramePr>
               <a:graphicFrameLocks xmlns:a="http://schemas.openxmlformats.org/drawingml/2006/main" noChangeAspect="1"/>
             </wp:cNvGraphicFramePr>
@@ -31300,7 +31298,7 @@
               <a:graphicData uri="http://schemas.openxmlformats.org/drawingml/2006/picture">
                 <pic:pic xmlns:pic="http://schemas.openxmlformats.org/drawingml/2006/picture">
                   <pic:nvPicPr>
-                    <pic:cNvPr id="0" name="Picture 5"/>
+                    <pic:cNvPr id="0" name="Picture 4"/>
                     <pic:cNvPicPr>
                       <a:picLocks noChangeAspect="1" noChangeArrowheads="1"/>
                     </pic:cNvPicPr>
@@ -31321,7 +31319,7 @@
                   <pic:spPr bwMode="auto">
                     <a:xfrm>
                       <a:off x="0" y="0"/>
-                      <a:ext cx="5410786" cy="3640768"/>
+                      <a:ext cx="5409761" cy="3654467"/>
                     </a:xfrm>
                     <a:prstGeom prst="rect">
                       <a:avLst/>
@@ -31408,10 +31406,10 @@
           <w:noProof/>
         </w:rPr>
         <w:drawing>
-          <wp:inline distT="0" distB="0" distL="0" distR="0" wp14:anchorId="03630C76" wp14:editId="78DD461B">
-            <wp:extent cx="5516880" cy="3724445"/>
-            <wp:effectExtent l="0" t="0" r="7620" b="9525"/>
-            <wp:docPr id="1089438778" name="Imagen 7"/>
+          <wp:inline distT="0" distB="0" distL="0" distR="0" wp14:anchorId="3C766DCF" wp14:editId="6C424524">
+            <wp:extent cx="5481099" cy="3688080"/>
+            <wp:effectExtent l="0" t="0" r="5715" b="7620"/>
+            <wp:docPr id="1235027705" name="Imagen 5"/>
             <wp:cNvGraphicFramePr>
               <a:graphicFrameLocks xmlns:a="http://schemas.openxmlformats.org/drawingml/2006/main" noChangeAspect="1"/>
             </wp:cNvGraphicFramePr>
@@ -31419,7 +31417,7 @@
               <a:graphicData uri="http://schemas.openxmlformats.org/drawingml/2006/picture">
                 <pic:pic xmlns:pic="http://schemas.openxmlformats.org/drawingml/2006/picture">
                   <pic:nvPicPr>
-                    <pic:cNvPr id="0" name="Picture 6"/>
+                    <pic:cNvPr id="0" name="Picture 5"/>
                     <pic:cNvPicPr>
                       <a:picLocks noChangeAspect="1" noChangeArrowheads="1"/>
                     </pic:cNvPicPr>
@@ -31440,7 +31438,7 @@
                   <pic:spPr bwMode="auto">
                     <a:xfrm>
                       <a:off x="0" y="0"/>
-                      <a:ext cx="5527423" cy="3731562"/>
+                      <a:ext cx="5486361" cy="3691621"/>
                     </a:xfrm>
                     <a:prstGeom prst="rect">
                       <a:avLst/>
@@ -31521,10 +31519,10 @@
           <w:noProof/>
         </w:rPr>
         <w:drawing>
-          <wp:inline distT="0" distB="0" distL="0" distR="0" wp14:anchorId="37388CAC" wp14:editId="59CFF98E">
-            <wp:extent cx="5505083" cy="3726180"/>
-            <wp:effectExtent l="0" t="0" r="635" b="7620"/>
-            <wp:docPr id="1080361898" name="Imagen 8"/>
+          <wp:inline distT="0" distB="0" distL="0" distR="0" wp14:anchorId="2A9B08D5" wp14:editId="2C71023C">
+            <wp:extent cx="5516760" cy="3741420"/>
+            <wp:effectExtent l="0" t="0" r="8255" b="0"/>
+            <wp:docPr id="1633231238" name="Imagen 6"/>
             <wp:cNvGraphicFramePr>
               <a:graphicFrameLocks xmlns:a="http://schemas.openxmlformats.org/drawingml/2006/main" noChangeAspect="1"/>
             </wp:cNvGraphicFramePr>
@@ -31532,7 +31530,7 @@
               <a:graphicData uri="http://schemas.openxmlformats.org/drawingml/2006/picture">
                 <pic:pic xmlns:pic="http://schemas.openxmlformats.org/drawingml/2006/picture">
                   <pic:nvPicPr>
-                    <pic:cNvPr id="0" name="Picture 7"/>
+                    <pic:cNvPr id="0" name="Picture 6"/>
                     <pic:cNvPicPr>
                       <a:picLocks noChangeAspect="1" noChangeArrowheads="1"/>
                     </pic:cNvPicPr>
@@ -31553,7 +31551,7 @@
                   <pic:spPr bwMode="auto">
                     <a:xfrm>
                       <a:off x="0" y="0"/>
-                      <a:ext cx="5520716" cy="3736761"/>
+                      <a:ext cx="5517861" cy="3742167"/>
                     </a:xfrm>
                     <a:prstGeom prst="rect">
                       <a:avLst/>
@@ -40045,6 +40043,7 @@
   <w:style w:type="character" w:default="1" w:styleId="Fuentedeprrafopredeter">
     <w:name w:val="Default Paragraph Font"/>
     <w:uiPriority w:val="1"/>
+    <w:semiHidden/>
     <w:unhideWhenUsed/>
   </w:style>
   <w:style w:type="table" w:default="1" w:styleId="Tablanormal">

</xml_diff>